<commit_message>
agrega reportes y perfil al ers
</commit_message>
<xml_diff>
--- a/docs/ERS-IronDisk-V2.docx
+++ b/docs/ERS-IronDisk-V2.docx
@@ -53,7 +53,7 @@
           <w:sz w:val="24"/>
           <w:szCs w:val="24"/>
         </w:rPr>
-        <w:t xml:space="preserve">Revisión: 2.0</w:t>
+        <w:t xml:space="preserve">Revisión: 2.1</w:t>
       </w:r>
     </w:p>
     <w:p>
@@ -66,7 +66,7 @@
           <w:sz w:val="24"/>
           <w:szCs w:val="24"/>
         </w:rPr>
-        <w:t xml:space="preserve">20 de octubre de 2026</w:t>
+        <w:t xml:space="preserve">21 de octubre de 2026</w:t>
       </w:r>
     </w:p>
     <w:p>
@@ -344,6 +344,123 @@
                 <w:szCs w:val="20"/>
               </w:rPr>
               <w:t xml:space="preserve">Se pasa el sitio a React y Bootstrap, se agregan checkout, órdenes, panel de administración ampliado y pruebas unitarias.</w:t>
+            </w:r>
+          </w:p>
+        </w:tc>
+      </w:tr>
+      <w:tr>
+        <w:trPr>
+          <w:tblHeader w:val="off"/>
+        </w:trPr>
+        <w:tc>
+          <w:tcPr>
+            <w:tcW w:type="dxa" w:w="1700"/>
+            <w:tcBorders>
+              <w:top w:val="single" w:color="999999" w:sz="4"/>
+              <w:left w:val="single" w:color="999999" w:sz="4"/>
+              <w:bottom w:val="single" w:color="999999" w:sz="4"/>
+              <w:right w:val="single" w:color="999999" w:sz="4"/>
+            </w:tcBorders>
+            <w:tcMar>
+              <w:top w:type="dxa" w:w="60"/>
+              <w:left w:type="dxa" w:w="100"/>
+              <w:bottom w:type="dxa" w:w="60"/>
+              <w:right w:type="dxa" w:w="100"/>
+            </w:tcMar>
+          </w:tcPr>
+          <w:p>
+            <w:r>
+              <w:rPr>
+                <w:b w:val="false"/>
+                <w:bCs w:val="false"/>
+                <w:sz w:val="20"/>
+                <w:szCs w:val="20"/>
+              </w:rPr>
+              <w:t xml:space="preserve">21-10-2026</w:t>
+            </w:r>
+          </w:p>
+        </w:tc>
+        <w:tc>
+          <w:tcPr>
+            <w:tcW w:type="dxa" w:w="1100"/>
+            <w:tcBorders>
+              <w:top w:val="single" w:color="999999" w:sz="4"/>
+              <w:left w:val="single" w:color="999999" w:sz="4"/>
+              <w:bottom w:val="single" w:color="999999" w:sz="4"/>
+              <w:right w:val="single" w:color="999999" w:sz="4"/>
+            </w:tcBorders>
+            <w:tcMar>
+              <w:top w:type="dxa" w:w="60"/>
+              <w:left w:type="dxa" w:w="100"/>
+              <w:bottom w:type="dxa" w:w="60"/>
+              <w:right w:type="dxa" w:w="100"/>
+            </w:tcMar>
+          </w:tcPr>
+          <w:p>
+            <w:r>
+              <w:rPr>
+                <w:b w:val="false"/>
+                <w:bCs w:val="false"/>
+                <w:sz w:val="20"/>
+                <w:szCs w:val="20"/>
+              </w:rPr>
+              <w:t xml:space="preserve">2.1</w:t>
+            </w:r>
+          </w:p>
+        </w:tc>
+        <w:tc>
+          <w:tcPr>
+            <w:tcW w:type="dxa" w:w="2700"/>
+            <w:tcBorders>
+              <w:top w:val="single" w:color="999999" w:sz="4"/>
+              <w:left w:val="single" w:color="999999" w:sz="4"/>
+              <w:bottom w:val="single" w:color="999999" w:sz="4"/>
+              <w:right w:val="single" w:color="999999" w:sz="4"/>
+            </w:tcBorders>
+            <w:tcMar>
+              <w:top w:type="dxa" w:w="60"/>
+              <w:left w:type="dxa" w:w="100"/>
+              <w:bottom w:type="dxa" w:w="60"/>
+              <w:right w:type="dxa" w:w="100"/>
+            </w:tcMar>
+          </w:tcPr>
+          <w:p>
+            <w:r>
+              <w:rPr>
+                <w:b w:val="false"/>
+                <w:bCs w:val="false"/>
+                <w:sz w:val="20"/>
+                <w:szCs w:val="20"/>
+              </w:rPr>
+              <w:t xml:space="preserve">Bastián Jofré y Renato Colipe</w:t>
+            </w:r>
+          </w:p>
+        </w:tc>
+        <w:tc>
+          <w:tcPr>
+            <w:tcW w:type="dxa" w:w="3800"/>
+            <w:tcBorders>
+              <w:top w:val="single" w:color="999999" w:sz="4"/>
+              <w:left w:val="single" w:color="999999" w:sz="4"/>
+              <w:bottom w:val="single" w:color="999999" w:sz="4"/>
+              <w:right w:val="single" w:color="999999" w:sz="4"/>
+            </w:tcBorders>
+            <w:tcMar>
+              <w:top w:type="dxa" w:w="60"/>
+              <w:left w:type="dxa" w:w="100"/>
+              <w:bottom w:type="dxa" w:w="60"/>
+              <w:right w:type="dxa" w:w="100"/>
+            </w:tcMar>
+          </w:tcPr>
+          <w:p>
+            <w:r>
+              <w:rPr>
+                <w:b w:val="false"/>
+                <w:bCs w:val="false"/>
+                <w:sz w:val="20"/>
+                <w:szCs w:val="20"/>
+              </w:rPr>
+              <w:t xml:space="preserve">Se agregan reportes y perfil del administrador (RF-17 y RF-18).</w:t>
             </w:r>
           </w:p>
         </w:tc>
@@ -1001,7 +1118,7 @@
         <w:spacing w:after="120"/>
       </w:pPr>
       <w:r>
-        <w:t xml:space="preserve">La sección 2 describe el contexto del producto: usuarios, restricciones y supuestos. La sección 3 detalla las interfaces, los requisitos funcionales (RF-01 al RF-16) y los no funcionales. Cada requisito tiene un código único para poder seguirlo hasta el código y las pruebas.</w:t>
+        <w:t xml:space="preserve">La sección 2 describe el contexto del producto: usuarios, restricciones y supuestos. La sección 3 detalla las interfaces, los requisitos funcionales (RF-01 al RF-18) y los no funcionales. Cada requisito tiene un código único para poder seguirlo hasta el código y las pruebas.</w:t>
       </w:r>
     </w:p>
     <w:p>
@@ -1098,7 +1215,7 @@
         <w:spacing w:after="60"/>
       </w:pPr>
       <w:r>
-        <w:t xml:space="preserve">Administración: panel con totales, mantenedor de productos, productos críticos, mantenedor de usuarios y órdenes con boleta.</w:t>
+        <w:t xml:space="preserve">Administración: panel con totales, mantenedor de productos, productos críticos, mantenedor de usuarios, órdenes con boleta, reportes y perfil.</w:t>
       </w:r>
     </w:p>
     <w:p>
@@ -1320,7 +1437,7 @@
         <w:spacing w:after="60"/>
       </w:pPr>
       <w:r>
-        <w:t xml:space="preserve">Reportes de ventas y gestión de categorías desde el panel de administración.</w:t>
+        <w:t xml:space="preserve">Gestión de categorías desde el panel de administración.</w:t>
       </w:r>
     </w:p>
     <w:p>
@@ -1910,6 +2027,54 @@
       </w:pPr>
       <w:r>
         <w:t xml:space="preserve">Descripción: El administrador puede ver el listado de órdenes generadas en el checkout y abrir el detalle de cada una como boleta, con los datos del cliente, la dirección y los productos comprados.</w:t>
+      </w:r>
+    </w:p>
+    <w:p>
+      <w:pPr>
+        <w:pStyle w:val="Heading3"/>
+      </w:pPr>
+      <w:r>
+        <w:t xml:space="preserve">RF-17 Reportes</w:t>
+      </w:r>
+    </w:p>
+    <w:p>
+      <w:pPr>
+        <w:spacing w:after="120"/>
+      </w:pPr>
+      <w:r>
+        <w:t xml:space="preserve">Actores: Administrador</w:t>
+      </w:r>
+    </w:p>
+    <w:p>
+      <w:pPr>
+        <w:spacing w:after="120"/>
+      </w:pPr>
+      <w:r>
+        <w:t xml:space="preserve">Descripción: El administrador puede ver un resumen de la tienda: total vendido, órdenes pagadas, pagos rechazados, productos con stock crítico, cantidad de productos por categoría y cantidad de usuarios por tipo.</w:t>
+      </w:r>
+    </w:p>
+    <w:p>
+      <w:pPr>
+        <w:pStyle w:val="Heading3"/>
+      </w:pPr>
+      <w:r>
+        <w:t xml:space="preserve">RF-18 Perfil del administrador</w:t>
+      </w:r>
+    </w:p>
+    <w:p>
+      <w:pPr>
+        <w:spacing w:after="120"/>
+      </w:pPr>
+      <w:r>
+        <w:t xml:space="preserve">Actores: Administrador</w:t>
+      </w:r>
+    </w:p>
+    <w:p>
+      <w:pPr>
+        <w:spacing w:after="120"/>
+      </w:pPr>
+      <w:r>
+        <w:t xml:space="preserve">Descripción: El administrador puede ver sus propios datos (RUN, nombre, correo, tipo, región, comuna y dirección) y entrar a editarlos desde un enlace al formulario de usuarios.</w:t>
       </w:r>
     </w:p>
     <w:p>

</xml_diff>